<commit_message>
Update Task 1 test plan
</commit_message>
<xml_diff>
--- a/Task1_Optimization_Test_Plan.docx
+++ b/Task1_Optimization_Test_Plan.docx
@@ -1966,7 +1966,19 @@
         <w:rPr>
           <w:color w:val="000000" w:themeColor="text1"/>
         </w:rPr>
-        <w:t>I test this feature on three levels: does it work as software, does the optimizer solve the problem correctly, and are the results scientifically valid. If I had to prioritise, I would spend most of my time on input validation, constraint handling and regression. Those are the areas where small defects can have the biggest impact, and they are often the hardest to spot. That's what gives me confidence that the optimization results can be trusted.</w:t>
+        <w:t xml:space="preserve">I test this feature on three levels: does it work as software, does the optimizer solve the problem correctly, and are the results scientifically valid. </w:t>
+      </w:r>
+      <w:r>
+        <w:rPr>
+          <w:color w:val="000000" w:themeColor="text1"/>
+        </w:rPr>
+        <w:t>Scenarios</w:t>
+      </w:r>
+      <w:r>
+        <w:rPr>
+          <w:color w:val="000000" w:themeColor="text1"/>
+        </w:rPr>
+        <w:t xml:space="preserve"> to prioritise, I would spend most of my time on input validation, constraint handling and regression. Those are the areas where small defects can have the biggest impact, and they are often the hardest to spot. That's what gives me confidence that the optimization results can be trusted.</w:t>
       </w:r>
     </w:p>
     <w:sectPr>

</xml_diff>